<commit_message>
fix: updated app.json for versioning on eas builds
</commit_message>
<xml_diff>
--- a/docs/Auxein Inisghts Deployment Workflow V1.0.docx
+++ b/docs/Auxein Inisghts Deployment Workflow V1.0.docx
@@ -12958,7 +12958,21 @@
         <w:rPr>
           <w:lang w:eastAsia="en-NZ"/>
         </w:rPr>
-        <w:t>Version is set in packages/mobile/</w:t>
+        <w:t xml:space="preserve">Two independent numbers, set </w:t>
+      </w:r>
+      <w:r>
+        <w:rPr>
+          <w:b/>
+          <w:bCs/>
+          <w:lang w:eastAsia="en-NZ"/>
+        </w:rPr>
+        <w:t>**locally**</w:t>
+      </w:r>
+      <w:r>
+        <w:rPr>
+          <w:lang w:eastAsia="en-NZ"/>
+        </w:rPr>
+        <w:t xml:space="preserve"> in `packages/mobile/</w:t>
       </w:r>
       <w:proofErr w:type="spellStart"/>
       <w:r>
@@ -12972,21 +12986,81 @@
         <w:rPr>
           <w:lang w:eastAsia="en-NZ"/>
         </w:rPr>
-        <w:t xml:space="preserve"> (</w:t>
+        <w:t>` and tracked in git (`</w:t>
       </w:r>
       <w:proofErr w:type="spellStart"/>
       <w:r>
         <w:rPr>
           <w:lang w:eastAsia="en-NZ"/>
         </w:rPr>
+        <w:t>appVersionSource</w:t>
+      </w:r>
+      <w:proofErr w:type="spellEnd"/>
+      <w:r>
+        <w:rPr>
+          <w:lang w:eastAsia="en-NZ"/>
+        </w:rPr>
+        <w:t>: "local"` in `</w:t>
+      </w:r>
+      <w:proofErr w:type="spellStart"/>
+      <w:r>
+        <w:rPr>
+          <w:lang w:eastAsia="en-NZ"/>
+        </w:rPr>
+        <w:t>eas.json</w:t>
+      </w:r>
+      <w:proofErr w:type="spellEnd"/>
+      <w:r>
+        <w:rPr>
+          <w:lang w:eastAsia="en-NZ"/>
+        </w:rPr>
+        <w:t>`):</w:t>
+      </w:r>
+    </w:p>
+    <w:p>
+      <w:pPr>
+        <w:ind w:left="720"/>
+        <w:rPr>
+          <w:lang w:eastAsia="en-NZ"/>
+        </w:rPr>
+      </w:pPr>
+      <w:r>
+        <w:rPr>
+          <w:lang w:eastAsia="en-NZ"/>
+        </w:rPr>
+        <w:t xml:space="preserve">- </w:t>
+      </w:r>
+      <w:r>
+        <w:rPr>
+          <w:b/>
+          <w:bCs/>
+          <w:lang w:eastAsia="en-NZ"/>
+        </w:rPr>
+        <w:t>**`</w:t>
+      </w:r>
+      <w:proofErr w:type="spellStart"/>
+      <w:r>
+        <w:rPr>
+          <w:b/>
+          <w:bCs/>
+          <w:lang w:eastAsia="en-NZ"/>
+        </w:rPr>
         <w:t>expo.version</w:t>
       </w:r>
       <w:proofErr w:type="spellEnd"/>
       <w:r>
         <w:rPr>
-          <w:lang w:eastAsia="en-NZ"/>
-        </w:rPr>
-        <w:t xml:space="preserve">, </w:t>
+          <w:b/>
+          <w:bCs/>
+          <w:lang w:eastAsia="en-NZ"/>
+        </w:rPr>
+        <w:t>`**</w:t>
+      </w:r>
+      <w:r>
+        <w:rPr>
+          <w:lang w:eastAsia="en-NZ"/>
+        </w:rPr>
+        <w:t xml:space="preserve"> — marketing </w:t>
       </w:r>
       <w:proofErr w:type="spellStart"/>
       <w:r>
@@ -13000,25 +13074,762 @@
         <w:rPr>
           <w:lang w:eastAsia="en-NZ"/>
         </w:rPr>
-        <w:t xml:space="preserve">). </w:t>
+        <w:t xml:space="preserve"> (MAJOR.MINOR.PATCH), shown on the store listing. Bumped </w:t>
+      </w:r>
+      <w:r>
+        <w:rPr>
+          <w:b/>
+          <w:bCs/>
+          <w:lang w:eastAsia="en-NZ"/>
+        </w:rPr>
+        <w:t>**deliberately per release**</w:t>
+      </w:r>
+      <w:r>
+        <w:rPr>
+          <w:lang w:eastAsia="en-NZ"/>
+        </w:rPr>
+        <w:t>, not per build.</w:t>
+      </w:r>
+    </w:p>
+    <w:p>
+      <w:pPr>
+        <w:ind w:left="720"/>
+        <w:rPr>
+          <w:lang w:eastAsia="en-NZ"/>
+        </w:rPr>
+      </w:pPr>
+      <w:r>
+        <w:rPr>
+          <w:lang w:eastAsia="en-NZ"/>
+        </w:rPr>
+        <w:t xml:space="preserve">- </w:t>
+      </w:r>
+      <w:r>
+        <w:rPr>
+          <w:b/>
+          <w:bCs/>
+          <w:lang w:eastAsia="en-NZ"/>
+        </w:rPr>
+        <w:t>**`</w:t>
       </w:r>
       <w:proofErr w:type="spellStart"/>
       <w:r>
         <w:rPr>
-          <w:lang w:eastAsia="en-NZ"/>
-        </w:rPr>
-        <w:t>versionCode</w:t>
+          <w:b/>
+          <w:bCs/>
+          <w:lang w:eastAsia="en-NZ"/>
+        </w:rPr>
+        <w:t>ios.buildNumber</w:t>
       </w:r>
       <w:proofErr w:type="spellEnd"/>
       <w:r>
         <w:rPr>
-          <w:lang w:eastAsia="en-NZ"/>
-        </w:rPr>
-        <w:t xml:space="preserve"> (Android) and </w:t>
+          <w:b/>
+          <w:bCs/>
+          <w:lang w:eastAsia="en-NZ"/>
+        </w:rPr>
+        <w:t>`**</w:t>
+      </w:r>
+      <w:r>
+        <w:rPr>
+          <w:lang w:eastAsia="en-NZ"/>
+        </w:rPr>
+        <w:t xml:space="preserve"> (string) and </w:t>
+      </w:r>
+      <w:r>
+        <w:rPr>
+          <w:b/>
+          <w:bCs/>
+          <w:lang w:eastAsia="en-NZ"/>
+        </w:rPr>
+        <w:t>**`</w:t>
       </w:r>
       <w:proofErr w:type="spellStart"/>
       <w:r>
         <w:rPr>
+          <w:b/>
+          <w:bCs/>
+          <w:lang w:eastAsia="en-NZ"/>
+        </w:rPr>
+        <w:t>android.versionCode</w:t>
+      </w:r>
+      <w:proofErr w:type="spellEnd"/>
+      <w:r>
+        <w:rPr>
+          <w:b/>
+          <w:bCs/>
+          <w:lang w:eastAsia="en-NZ"/>
+        </w:rPr>
+        <w:t>`**</w:t>
+      </w:r>
+      <w:r>
+        <w:rPr>
+          <w:lang w:eastAsia="en-NZ"/>
+        </w:rPr>
+        <w:t xml:space="preserve"> (integer) — the per-upload build counter. Kept in </w:t>
+      </w:r>
+      <w:r>
+        <w:rPr>
+          <w:b/>
+          <w:bCs/>
+          <w:lang w:eastAsia="en-NZ"/>
+        </w:rPr>
+        <w:t>**lockstep**</w:t>
+      </w:r>
+      <w:r>
+        <w:rPr>
+          <w:lang w:eastAsia="en-NZ"/>
+        </w:rPr>
+        <w:t xml:space="preserve"> (the same integer) and incremented on </w:t>
+      </w:r>
+      <w:r>
+        <w:rPr>
+          <w:b/>
+          <w:bCs/>
+          <w:lang w:eastAsia="en-NZ"/>
+        </w:rPr>
+        <w:t>**every**</w:t>
+      </w:r>
+      <w:r>
+        <w:rPr>
+          <w:lang w:eastAsia="en-NZ"/>
+        </w:rPr>
+        <w:t xml:space="preserve"> build. Never reused.</w:t>
+      </w:r>
+    </w:p>
+    <w:p>
+      <w:pPr>
+        <w:rPr>
+          <w:lang w:eastAsia="en-NZ"/>
+        </w:rPr>
+      </w:pPr>
+      <w:r>
+        <w:rPr>
+          <w:lang w:eastAsia="en-NZ"/>
+        </w:rPr>
+        <w:t>Why local rather than remote: the build number lives in the repo, pinned to the commit that produced the build. There is no invisible EAS server counter that can drift out of sync with the stores — that drift was the cause of the duplicate-build-number rejection (`build number N already used`).</w:t>
+      </w:r>
+    </w:p>
+    <w:p>
+      <w:pPr>
+        <w:pStyle w:val="Heading4"/>
+        <w:rPr>
+          <w:lang w:eastAsia="en-NZ"/>
+        </w:rPr>
+      </w:pPr>
+      <w:r>
+        <w:rPr>
+          <w:lang w:eastAsia="en-NZ"/>
+        </w:rPr>
+        <w:t>Bu</w:t>
+      </w:r>
+      <w:r>
+        <w:rPr>
+          <w:lang w:eastAsia="en-NZ"/>
+        </w:rPr>
+        <w:t>mp before every build:</w:t>
+      </w:r>
+    </w:p>
+    <w:tbl>
+      <w:tblPr>
+        <w:tblStyle w:val="TableGrid"/>
+        <w:tblW w:w="0" w:type="auto"/>
+        <w:tblLook w:val="04A0" w:firstRow="1" w:lastRow="0" w:firstColumn="1" w:lastColumn="0" w:noHBand="0" w:noVBand="1"/>
+      </w:tblPr>
+      <w:tblGrid>
+        <w:gridCol w:w="2405"/>
+        <w:gridCol w:w="6611"/>
+      </w:tblGrid>
+      <w:tr>
+        <w:tc>
+          <w:tcPr>
+            <w:tcW w:w="2405" w:type="dxa"/>
+          </w:tcPr>
+          <w:p>
+            <w:pPr>
+              <w:rPr>
+                <w:lang w:eastAsia="en-NZ"/>
+              </w:rPr>
+            </w:pPr>
+            <w:r>
+              <w:rPr>
+                <w:lang w:eastAsia="en-NZ"/>
+              </w:rPr>
+              <w:t>Command</w:t>
+            </w:r>
+          </w:p>
+        </w:tc>
+        <w:tc>
+          <w:tcPr>
+            <w:tcW w:w="6611" w:type="dxa"/>
+          </w:tcPr>
+          <w:p>
+            <w:pPr>
+              <w:rPr>
+                <w:lang w:eastAsia="en-NZ"/>
+              </w:rPr>
+            </w:pPr>
+            <w:r>
+              <w:rPr>
+                <w:lang w:eastAsia="en-NZ"/>
+              </w:rPr>
+              <w:t>Effect</w:t>
+            </w:r>
+          </w:p>
+        </w:tc>
+      </w:tr>
+      <w:tr>
+        <w:tc>
+          <w:tcPr>
+            <w:tcW w:w="2405" w:type="dxa"/>
+          </w:tcPr>
+          <w:p>
+            <w:pPr>
+              <w:rPr>
+                <w:lang w:eastAsia="en-NZ"/>
+              </w:rPr>
+            </w:pPr>
+            <w:proofErr w:type="spellStart"/>
+            <w:r>
+              <w:rPr>
+                <w:lang w:eastAsia="en-NZ"/>
+              </w:rPr>
+              <w:t>npm</w:t>
+            </w:r>
+            <w:proofErr w:type="spellEnd"/>
+            <w:r>
+              <w:rPr>
+                <w:lang w:eastAsia="en-NZ"/>
+              </w:rPr>
+              <w:t xml:space="preserve"> run </w:t>
+            </w:r>
+            <w:proofErr w:type="spellStart"/>
+            <w:r>
+              <w:rPr>
+                <w:lang w:eastAsia="en-NZ"/>
+              </w:rPr>
+              <w:t>bump:build</w:t>
+            </w:r>
+            <w:proofErr w:type="spellEnd"/>
+          </w:p>
+        </w:tc>
+        <w:tc>
+          <w:tcPr>
+            <w:tcW w:w="6611" w:type="dxa"/>
+          </w:tcPr>
+          <w:p>
+            <w:pPr>
+              <w:rPr>
+                <w:lang w:eastAsia="en-NZ"/>
+              </w:rPr>
+            </w:pPr>
+            <w:r>
+              <w:rPr>
+                <w:lang w:eastAsia="en-NZ"/>
+              </w:rPr>
+              <w:t>+1 build number only (same release, new build) — most common</w:t>
+            </w:r>
+          </w:p>
+        </w:tc>
+      </w:tr>
+      <w:tr>
+        <w:tc>
+          <w:tcPr>
+            <w:tcW w:w="2405" w:type="dxa"/>
+          </w:tcPr>
+          <w:p>
+            <w:pPr>
+              <w:rPr>
+                <w:lang w:eastAsia="en-NZ"/>
+              </w:rPr>
+            </w:pPr>
+            <w:proofErr w:type="spellStart"/>
+            <w:r>
+              <w:rPr>
+                <w:lang w:eastAsia="en-NZ"/>
+              </w:rPr>
+              <w:t>npm</w:t>
+            </w:r>
+            <w:proofErr w:type="spellEnd"/>
+            <w:r>
+              <w:rPr>
+                <w:lang w:eastAsia="en-NZ"/>
+              </w:rPr>
+              <w:t xml:space="preserve"> run </w:t>
+            </w:r>
+            <w:proofErr w:type="spellStart"/>
+            <w:r>
+              <w:rPr>
+                <w:lang w:eastAsia="en-NZ"/>
+              </w:rPr>
+              <w:t>bump:patch</w:t>
+            </w:r>
+            <w:proofErr w:type="spellEnd"/>
+          </w:p>
+        </w:tc>
+        <w:tc>
+          <w:tcPr>
+            <w:tcW w:w="6611" w:type="dxa"/>
+          </w:tcPr>
+          <w:p>
+            <w:pPr>
+              <w:rPr>
+                <w:lang w:eastAsia="en-NZ"/>
+              </w:rPr>
+            </w:pPr>
+            <w:r>
+              <w:rPr>
+                <w:lang w:eastAsia="en-NZ"/>
+              </w:rPr>
+              <w:t>+1 build AND 0.1.1 → 0.1.2 (bugfix release)</w:t>
+            </w:r>
+          </w:p>
+        </w:tc>
+      </w:tr>
+      <w:tr>
+        <w:tc>
+          <w:tcPr>
+            <w:tcW w:w="2405" w:type="dxa"/>
+          </w:tcPr>
+          <w:p>
+            <w:pPr>
+              <w:rPr>
+                <w:lang w:eastAsia="en-NZ"/>
+              </w:rPr>
+            </w:pPr>
+            <w:proofErr w:type="spellStart"/>
+            <w:r>
+              <w:rPr>
+                <w:lang w:eastAsia="en-NZ"/>
+              </w:rPr>
+              <w:t>npm</w:t>
+            </w:r>
+            <w:proofErr w:type="spellEnd"/>
+            <w:r>
+              <w:rPr>
+                <w:lang w:eastAsia="en-NZ"/>
+              </w:rPr>
+              <w:t xml:space="preserve"> run </w:t>
+            </w:r>
+            <w:proofErr w:type="spellStart"/>
+            <w:r>
+              <w:rPr>
+                <w:lang w:eastAsia="en-NZ"/>
+              </w:rPr>
+              <w:t>bump:minor</w:t>
+            </w:r>
+            <w:proofErr w:type="spellEnd"/>
+          </w:p>
+        </w:tc>
+        <w:tc>
+          <w:tcPr>
+            <w:tcW w:w="6611" w:type="dxa"/>
+          </w:tcPr>
+          <w:p>
+            <w:pPr>
+              <w:rPr>
+                <w:lang w:eastAsia="en-NZ"/>
+              </w:rPr>
+            </w:pPr>
+            <w:r>
+              <w:rPr>
+                <w:lang w:eastAsia="en-NZ"/>
+              </w:rPr>
+              <w:t>+1 build AND 0.1.1 → 0.2.0 (feature release)</w:t>
+            </w:r>
+          </w:p>
+        </w:tc>
+      </w:tr>
+      <w:tr>
+        <w:tc>
+          <w:tcPr>
+            <w:tcW w:w="2405" w:type="dxa"/>
+          </w:tcPr>
+          <w:p>
+            <w:pPr>
+              <w:rPr>
+                <w:lang w:eastAsia="en-NZ"/>
+              </w:rPr>
+            </w:pPr>
+            <w:proofErr w:type="spellStart"/>
+            <w:r>
+              <w:rPr>
+                <w:lang w:eastAsia="en-NZ"/>
+              </w:rPr>
+              <w:t>npm</w:t>
+            </w:r>
+            <w:proofErr w:type="spellEnd"/>
+            <w:r>
+              <w:rPr>
+                <w:lang w:eastAsia="en-NZ"/>
+              </w:rPr>
+              <w:t xml:space="preserve"> run </w:t>
+            </w:r>
+            <w:proofErr w:type="spellStart"/>
+            <w:r>
+              <w:rPr>
+                <w:lang w:eastAsia="en-NZ"/>
+              </w:rPr>
+              <w:t>bump:major</w:t>
+            </w:r>
+            <w:proofErr w:type="spellEnd"/>
+          </w:p>
+        </w:tc>
+        <w:tc>
+          <w:tcPr>
+            <w:tcW w:w="6611" w:type="dxa"/>
+          </w:tcPr>
+          <w:p>
+            <w:pPr>
+              <w:rPr>
+                <w:lang w:eastAsia="en-NZ"/>
+              </w:rPr>
+            </w:pPr>
+            <w:r>
+              <w:rPr>
+                <w:lang w:eastAsia="en-NZ"/>
+              </w:rPr>
+              <w:t>+1 build AND → 1.0.0</w:t>
+            </w:r>
+          </w:p>
+        </w:tc>
+      </w:tr>
+      <w:tr>
+        <w:tc>
+          <w:tcPr>
+            <w:tcW w:w="2405" w:type="dxa"/>
+          </w:tcPr>
+          <w:p>
+            <w:pPr>
+              <w:rPr>
+                <w:lang w:eastAsia="en-NZ"/>
+              </w:rPr>
+            </w:pPr>
+            <w:proofErr w:type="spellStart"/>
+            <w:r>
+              <w:rPr>
+                <w:lang w:eastAsia="en-NZ"/>
+              </w:rPr>
+              <w:t>npm</w:t>
+            </w:r>
+            <w:proofErr w:type="spellEnd"/>
+            <w:r>
+              <w:rPr>
+                <w:lang w:eastAsia="en-NZ"/>
+              </w:rPr>
+              <w:t xml:space="preserve"> run </w:t>
+            </w:r>
+            <w:proofErr w:type="spellStart"/>
+            <w:r>
+              <w:rPr>
+                <w:lang w:eastAsia="en-NZ"/>
+              </w:rPr>
+              <w:t>version:show</w:t>
+            </w:r>
+            <w:proofErr w:type="spellEnd"/>
+          </w:p>
+        </w:tc>
+        <w:tc>
+          <w:tcPr>
+            <w:tcW w:w="6611" w:type="dxa"/>
+          </w:tcPr>
+          <w:p>
+            <w:pPr>
+              <w:rPr>
+                <w:lang w:eastAsia="en-NZ"/>
+              </w:rPr>
+            </w:pPr>
+            <w:r>
+              <w:rPr>
+                <w:lang w:eastAsia="en-NZ"/>
+              </w:rPr>
+              <w:t>print current numbers, change nothing</w:t>
+            </w:r>
+          </w:p>
+        </w:tc>
+      </w:tr>
+      <w:tr>
+        <w:tc>
+          <w:tcPr>
+            <w:tcW w:w="2405" w:type="dxa"/>
+          </w:tcPr>
+          <w:p>
+            <w:pPr>
+              <w:rPr>
+                <w:lang w:eastAsia="en-NZ"/>
+              </w:rPr>
+            </w:pPr>
+            <w:proofErr w:type="spellStart"/>
+            <w:r>
+              <w:rPr>
+                <w:lang w:eastAsia="en-NZ"/>
+              </w:rPr>
+              <w:t>npm</w:t>
+            </w:r>
+            <w:proofErr w:type="spellEnd"/>
+            <w:r>
+              <w:rPr>
+                <w:lang w:eastAsia="en-NZ"/>
+              </w:rPr>
+              <w:t xml:space="preserve"> run </w:t>
+            </w:r>
+            <w:proofErr w:type="spellStart"/>
+            <w:r>
+              <w:rPr>
+                <w:lang w:eastAsia="en-NZ"/>
+              </w:rPr>
+              <w:t>bump:build</w:t>
+            </w:r>
+            <w:proofErr w:type="spellEnd"/>
+            <w:r>
+              <w:rPr>
+                <w:lang w:eastAsia="en-NZ"/>
+              </w:rPr>
+              <w:t xml:space="preserve"> -- --build N</w:t>
+            </w:r>
+          </w:p>
+        </w:tc>
+        <w:tc>
+          <w:tcPr>
+            <w:tcW w:w="6611" w:type="dxa"/>
+          </w:tcPr>
+          <w:p>
+            <w:pPr>
+              <w:rPr>
+                <w:lang w:eastAsia="en-NZ"/>
+              </w:rPr>
+            </w:pPr>
+            <w:r>
+              <w:rPr>
+                <w:lang w:eastAsia="en-NZ"/>
+              </w:rPr>
+              <w:t>force a specific build integer (e.g. to clear a store clash)</w:t>
+            </w:r>
+          </w:p>
+        </w:tc>
+      </w:tr>
+    </w:tbl>
+    <w:p>
+      <w:pPr>
+        <w:rPr>
+          <w:lang w:eastAsia="en-NZ"/>
+        </w:rPr>
+      </w:pPr>
+      <w:r>
+        <w:rPr>
+          <w:lang w:eastAsia="en-NZ"/>
+        </w:rPr>
+        <w:t>The bump script is `packages/mobile/scripts/bump-</w:t>
+      </w:r>
+      <w:proofErr w:type="spellStart"/>
+      <w:r>
+        <w:rPr>
+          <w:lang w:eastAsia="en-NZ"/>
+        </w:rPr>
+        <w:t>build.mjs</w:t>
+      </w:r>
+      <w:proofErr w:type="spellEnd"/>
+      <w:r>
+        <w:rPr>
+          <w:lang w:eastAsia="en-NZ"/>
+        </w:rPr>
+        <w:t>`.</w:t>
+      </w:r>
+    </w:p>
+    <w:p>
+      <w:pPr>
+        <w:rPr>
+          <w:lang w:eastAsia="en-NZ"/>
+        </w:rPr>
+      </w:pPr>
+    </w:p>
+    <w:p>
+      <w:pPr>
+        <w:pStyle w:val="Heading4"/>
+        <w:rPr>
+          <w:lang w:eastAsia="en-NZ"/>
+        </w:rPr>
+      </w:pPr>
+      <w:r>
+        <w:rPr>
+          <w:lang w:eastAsia="en-NZ"/>
+        </w:rPr>
+        <w:lastRenderedPageBreak/>
+        <w:t>Rules</w:t>
+      </w:r>
+    </w:p>
+    <w:p>
+      <w:pPr>
+        <w:pStyle w:val="ListParagraph"/>
+        <w:numPr>
+          <w:ilvl w:val="0"/>
+          <w:numId w:val="17"/>
+        </w:numPr>
+        <w:rPr>
+          <w:lang w:eastAsia="en-NZ"/>
+        </w:rPr>
+      </w:pPr>
+      <w:r>
+        <w:rPr>
+          <w:lang w:eastAsia="en-NZ"/>
+        </w:rPr>
+        <w:t xml:space="preserve">Run a bump command → </w:t>
+      </w:r>
+      <w:r>
+        <w:rPr>
+          <w:b/>
+          <w:bCs/>
+          <w:lang w:eastAsia="en-NZ"/>
+        </w:rPr>
+        <w:t>**commit `</w:t>
+      </w:r>
+      <w:proofErr w:type="spellStart"/>
+      <w:r>
+        <w:rPr>
+          <w:b/>
+          <w:bCs/>
+          <w:lang w:eastAsia="en-NZ"/>
+        </w:rPr>
+        <w:t>app.json</w:t>
+      </w:r>
+      <w:proofErr w:type="spellEnd"/>
+      <w:r>
+        <w:rPr>
+          <w:b/>
+          <w:bCs/>
+          <w:lang w:eastAsia="en-NZ"/>
+        </w:rPr>
+        <w:t>`**</w:t>
+      </w:r>
+      <w:r>
+        <w:rPr>
+          <w:lang w:eastAsia="en-NZ"/>
+        </w:rPr>
+        <w:t xml:space="preserve"> → then `</w:t>
+      </w:r>
+      <w:proofErr w:type="spellStart"/>
+      <w:r>
+        <w:rPr>
+          <w:lang w:eastAsia="en-NZ"/>
+        </w:rPr>
+        <w:t>eas</w:t>
+      </w:r>
+      <w:proofErr w:type="spellEnd"/>
+      <w:r>
+        <w:rPr>
+          <w:lang w:eastAsia="en-NZ"/>
+        </w:rPr>
+        <w:t xml:space="preserve"> build`. With local versioning, EAS reads `</w:t>
+      </w:r>
+      <w:proofErr w:type="spellStart"/>
+      <w:r>
+        <w:rPr>
+          <w:lang w:eastAsia="en-NZ"/>
+        </w:rPr>
+        <w:t>app.json</w:t>
+      </w:r>
+      <w:proofErr w:type="spellEnd"/>
+      <w:r>
+        <w:rPr>
+          <w:lang w:eastAsia="en-NZ"/>
+        </w:rPr>
+        <w:t xml:space="preserve">` from the </w:t>
+      </w:r>
+      <w:r>
+        <w:rPr>
+          <w:b/>
+          <w:bCs/>
+          <w:lang w:eastAsia="en-NZ"/>
+        </w:rPr>
+        <w:t>**committed git state**</w:t>
+      </w:r>
+      <w:r>
+        <w:rPr>
+          <w:lang w:eastAsia="en-NZ"/>
+        </w:rPr>
+        <w:t xml:space="preserve"> — an uncommitted bump is silently ignored.</w:t>
+      </w:r>
+    </w:p>
+    <w:p>
+      <w:pPr>
+        <w:pStyle w:val="ListParagraph"/>
+        <w:numPr>
+          <w:ilvl w:val="0"/>
+          <w:numId w:val="17"/>
+        </w:numPr>
+        <w:rPr>
+          <w:lang w:eastAsia="en-NZ"/>
+        </w:rPr>
+      </w:pPr>
+      <w:r>
+        <w:rPr>
+          <w:lang w:eastAsia="en-NZ"/>
+        </w:rPr>
+        <w:t>Build both platforms together (`</w:t>
+      </w:r>
+      <w:proofErr w:type="spellStart"/>
+      <w:r>
+        <w:rPr>
+          <w:lang w:eastAsia="en-NZ"/>
+        </w:rPr>
+        <w:t>eas</w:t>
+      </w:r>
+      <w:proofErr w:type="spellEnd"/>
+      <w:r>
+        <w:rPr>
+          <w:lang w:eastAsia="en-NZ"/>
+        </w:rPr>
+        <w:t xml:space="preserve"> build --platform all --profile production`) so the single number stays identical across stores.</w:t>
+      </w:r>
+    </w:p>
+    <w:p>
+      <w:pPr>
+        <w:pStyle w:val="ListParagraph"/>
+        <w:numPr>
+          <w:ilvl w:val="0"/>
+          <w:numId w:val="17"/>
+        </w:numPr>
+        <w:rPr>
+          <w:lang w:eastAsia="en-NZ"/>
+        </w:rPr>
+      </w:pPr>
+      <w:r>
+        <w:rPr>
+          <w:lang w:eastAsia="en-NZ"/>
+        </w:rPr>
+        <w:t>`</w:t>
+      </w:r>
+      <w:proofErr w:type="spellStart"/>
+      <w:r>
+        <w:rPr>
+          <w:lang w:eastAsia="en-NZ"/>
+        </w:rPr>
+        <w:t>android.versionCode</w:t>
+      </w:r>
+      <w:proofErr w:type="spellEnd"/>
+      <w:r>
+        <w:rPr>
+          <w:lang w:eastAsia="en-NZ"/>
+        </w:rPr>
+        <w:t xml:space="preserve">` must be </w:t>
+      </w:r>
+      <w:r>
+        <w:rPr>
+          <w:b/>
+          <w:bCs/>
+          <w:lang w:eastAsia="en-NZ"/>
+        </w:rPr>
+        <w:t>**strictly greater**</w:t>
+      </w:r>
+      <w:r>
+        <w:rPr>
+          <w:lang w:eastAsia="en-NZ"/>
+        </w:rPr>
+        <w:t xml:space="preserve"> than the highest ever uploaded to Play (across all tracks). iOS `</w:t>
+      </w:r>
+      <w:proofErr w:type="spellStart"/>
+      <w:r>
+        <w:rPr>
           <w:lang w:eastAsia="en-NZ"/>
         </w:rPr>
         <w:t>buildNumber</w:t>
@@ -13028,84 +13839,25 @@
         <w:rPr>
           <w:lang w:eastAsia="en-NZ"/>
         </w:rPr>
-        <w:t xml:space="preserve"> (iOS) are managed remotely by EAS — </w:t>
-      </w:r>
-      <w:proofErr w:type="spellStart"/>
-      <w:r>
-        <w:rPr>
-          <w:lang w:eastAsia="en-NZ"/>
-        </w:rPr>
-        <w:t>appVersionSource</w:t>
-      </w:r>
-      <w:proofErr w:type="spellEnd"/>
-      <w:r>
-        <w:rPr>
-          <w:lang w:eastAsia="en-NZ"/>
-        </w:rPr>
-        <w:t xml:space="preserve">: "remote" in </w:t>
-      </w:r>
-      <w:proofErr w:type="spellStart"/>
-      <w:r>
-        <w:rPr>
-          <w:lang w:eastAsia="en-NZ"/>
-        </w:rPr>
-        <w:t>eas.json</w:t>
-      </w:r>
-      <w:proofErr w:type="spellEnd"/>
-      <w:r>
-        <w:rPr>
-          <w:lang w:eastAsia="en-NZ"/>
-        </w:rPr>
-        <w:t>. Do not edit these manually.</w:t>
-      </w:r>
-    </w:p>
-    <w:p>
-      <w:pPr>
-        <w:rPr>
-          <w:lang w:eastAsia="en-NZ"/>
-        </w:rPr>
-      </w:pPr>
-      <w:r>
-        <w:rPr>
-          <w:lang w:eastAsia="en-NZ"/>
-        </w:rPr>
-        <w:t xml:space="preserve">Bump </w:t>
-      </w:r>
-      <w:proofErr w:type="spellStart"/>
-      <w:r>
-        <w:rPr>
-          <w:lang w:eastAsia="en-NZ"/>
-        </w:rPr>
-        <w:t>expo.version</w:t>
-      </w:r>
-      <w:proofErr w:type="spellEnd"/>
-      <w:r>
-        <w:rPr>
-          <w:lang w:eastAsia="en-NZ"/>
-        </w:rPr>
-        <w:t xml:space="preserve"> on each release that contains user-visible changes. EAS auto-increments the platform build numbers on every build via </w:t>
-      </w:r>
-      <w:proofErr w:type="spellStart"/>
-      <w:proofErr w:type="gramStart"/>
-      <w:r>
-        <w:rPr>
-          <w:lang w:eastAsia="en-NZ"/>
-        </w:rPr>
-        <w:t>autoIncrement</w:t>
-      </w:r>
-      <w:proofErr w:type="spellEnd"/>
-      <w:r>
-        <w:rPr>
-          <w:lang w:eastAsia="en-NZ"/>
-        </w:rPr>
-        <w:t>:</w:t>
-      </w:r>
-      <w:proofErr w:type="gramEnd"/>
-      <w:r>
-        <w:rPr>
-          <w:lang w:eastAsia="en-NZ"/>
-        </w:rPr>
-        <w:t xml:space="preserve"> true in the production profile.</w:t>
+        <w:t>` must be unique within the version train. The bump script self-heals any drift by using `max(iOS, Android) + 1`.</w:t>
+      </w:r>
+    </w:p>
+    <w:p>
+      <w:pPr>
+        <w:pStyle w:val="ListParagraph"/>
+        <w:numPr>
+          <w:ilvl w:val="0"/>
+          <w:numId w:val="17"/>
+        </w:numPr>
+        <w:rPr>
+          <w:lang w:eastAsia="en-NZ"/>
+        </w:rPr>
+      </w:pPr>
+      <w:r>
+        <w:rPr>
+          <w:lang w:eastAsia="en-NZ"/>
+        </w:rPr>
+        <w:t>Never hand-edit the build numbers except via the bump script (or a deliberate one-off to clear a clash).</w:t>
       </w:r>
     </w:p>
     <w:p>
@@ -13396,7 +14148,6 @@
         <w:rPr>
           <w:lang w:eastAsia="en-NZ"/>
         </w:rPr>
-        <w:lastRenderedPageBreak/>
         <w:t>development — APK / dev-client iOS build, internal distribution, Metro-connected for hot reload</w:t>
       </w:r>
     </w:p>
@@ -13549,6 +14300,7 @@
         <w:rPr>
           <w:lang w:eastAsia="en-NZ"/>
         </w:rPr>
+        <w:lastRenderedPageBreak/>
         <w:t xml:space="preserve">(Uses Expo's resolver to pick the version matching SDK 54. Do not add manually to </w:t>
       </w:r>
       <w:proofErr w:type="spellStart"/>
@@ -14118,7 +14870,6 @@
         <w:rPr>
           <w:lang w:eastAsia="en-NZ"/>
         </w:rPr>
-        <w:lastRenderedPageBreak/>
         <w:t>cd packages/mobile</w:t>
       </w:r>
     </w:p>
@@ -14330,6 +15081,7 @@
         <w:rPr>
           <w:lang w:eastAsia="en-NZ"/>
         </w:rPr>
+        <w:lastRenderedPageBreak/>
         <w:t>Metro starts, terminal shows a QR code and a Metro URL like exp+auxein-grow://expo-development-client/?url=http%3A%2F%2F192.168.1.144%3A8081.</w:t>
       </w:r>
     </w:p>
@@ -14653,240 +15405,240 @@
         <w:rPr>
           <w:lang w:eastAsia="en-NZ"/>
         </w:rPr>
+        <w:t>cd packages/mobile</w:t>
+      </w:r>
+    </w:p>
+    <w:p>
+      <w:pPr>
+        <w:rPr>
+          <w:lang w:eastAsia="en-NZ"/>
+        </w:rPr>
+      </w:pPr>
+      <w:r>
+        <w:rPr>
+          <w:lang w:eastAsia="en-NZ"/>
+        </w:rPr>
+        <w:t># Submits latest iOS build to App Store Connect</w:t>
+      </w:r>
+    </w:p>
+    <w:p>
+      <w:pPr>
+        <w:rPr>
+          <w:lang w:eastAsia="en-NZ"/>
+        </w:rPr>
+      </w:pPr>
+      <w:proofErr w:type="spellStart"/>
+      <w:r>
+        <w:rPr>
+          <w:lang w:eastAsia="en-NZ"/>
+        </w:rPr>
+        <w:t>eas</w:t>
+      </w:r>
+      <w:proofErr w:type="spellEnd"/>
+      <w:r>
+        <w:rPr>
+          <w:lang w:eastAsia="en-NZ"/>
+        </w:rPr>
+        <w:t xml:space="preserve"> submit --platform </w:t>
+      </w:r>
+      <w:proofErr w:type="spellStart"/>
+      <w:r>
+        <w:rPr>
+          <w:lang w:eastAsia="en-NZ"/>
+        </w:rPr>
+        <w:t>ios</w:t>
+      </w:r>
+      <w:proofErr w:type="spellEnd"/>
+      <w:r>
+        <w:rPr>
+          <w:lang w:eastAsia="en-NZ"/>
+        </w:rPr>
+        <w:t xml:space="preserve"> --latest</w:t>
+      </w:r>
+    </w:p>
+    <w:p>
+      <w:pPr>
+        <w:rPr>
+          <w:lang w:eastAsia="en-NZ"/>
+        </w:rPr>
+      </w:pPr>
+      <w:r>
+        <w:rPr>
+          <w:lang w:eastAsia="en-NZ"/>
+        </w:rPr>
+        <w:t>Build processes in App Store Connect (~10–20 min), then becomes available to internal testers. External testers require Apple Beta App Review (~24h).</w:t>
+      </w:r>
+    </w:p>
+    <w:p>
+      <w:pPr>
+        <w:pStyle w:val="Heading3"/>
+        <w:rPr>
+          <w:lang w:eastAsia="en-NZ"/>
+        </w:rPr>
+      </w:pPr>
+      <w:r>
+        <w:rPr>
+          <w:lang w:eastAsia="en-NZ"/>
+        </w:rPr>
+        <w:t>12.5 Release to Internal Testing (automated submit — Android)</w:t>
+      </w:r>
+    </w:p>
+    <w:p>
+      <w:pPr>
+        <w:rPr>
+          <w:lang w:eastAsia="en-NZ"/>
+        </w:rPr>
+      </w:pPr>
+      <w:proofErr w:type="spellStart"/>
+      <w:r>
+        <w:rPr>
+          <w:lang w:eastAsia="en-NZ"/>
+        </w:rPr>
+        <w:t>eas</w:t>
+      </w:r>
+      <w:proofErr w:type="spellEnd"/>
+      <w:r>
+        <w:rPr>
+          <w:lang w:eastAsia="en-NZ"/>
+        </w:rPr>
+        <w:t xml:space="preserve"> submit for Android requires the Play Console service account JSON. The canonical copy lives in AWS Secrets Manager. Pull at submit time:</w:t>
+      </w:r>
+    </w:p>
+    <w:p>
+      <w:pPr>
+        <w:rPr>
+          <w:lang w:eastAsia="en-NZ"/>
+        </w:rPr>
+      </w:pPr>
+      <w:proofErr w:type="spellStart"/>
+      <w:r>
+        <w:rPr>
+          <w:lang w:eastAsia="en-NZ"/>
+        </w:rPr>
+        <w:t>aws</w:t>
+      </w:r>
+      <w:proofErr w:type="spellEnd"/>
+      <w:r>
+        <w:rPr>
+          <w:lang w:eastAsia="en-NZ"/>
+        </w:rPr>
+        <w:t xml:space="preserve"> </w:t>
+      </w:r>
+      <w:proofErr w:type="spellStart"/>
+      <w:r>
+        <w:rPr>
+          <w:lang w:eastAsia="en-NZ"/>
+        </w:rPr>
+        <w:t>secretsmanager</w:t>
+      </w:r>
+      <w:proofErr w:type="spellEnd"/>
+      <w:r>
+        <w:rPr>
+          <w:lang w:eastAsia="en-NZ"/>
+        </w:rPr>
+        <w:t xml:space="preserve"> get-secret-value \</w:t>
+      </w:r>
+    </w:p>
+    <w:p>
+      <w:pPr>
+        <w:rPr>
+          <w:lang w:eastAsia="en-NZ"/>
+        </w:rPr>
+      </w:pPr>
+      <w:r>
+        <w:rPr>
+          <w:lang w:eastAsia="en-NZ"/>
+        </w:rPr>
+        <w:t xml:space="preserve">--secret-id </w:t>
+      </w:r>
+      <w:proofErr w:type="spellStart"/>
+      <w:r>
+        <w:rPr>
+          <w:lang w:eastAsia="en-NZ"/>
+        </w:rPr>
+        <w:t>auxein</w:t>
+      </w:r>
+      <w:proofErr w:type="spellEnd"/>
+      <w:r>
+        <w:rPr>
+          <w:lang w:eastAsia="en-NZ"/>
+        </w:rPr>
+        <w:t>/grow/play-console-service-account \</w:t>
+      </w:r>
+    </w:p>
+    <w:p>
+      <w:pPr>
+        <w:rPr>
+          <w:lang w:eastAsia="en-NZ"/>
+        </w:rPr>
+      </w:pPr>
+      <w:r>
+        <w:rPr>
+          <w:lang w:eastAsia="en-NZ"/>
+        </w:rPr>
+        <w:t>--region ap-southeast-2 \</w:t>
+      </w:r>
+    </w:p>
+    <w:p>
+      <w:pPr>
+        <w:rPr>
+          <w:lang w:eastAsia="en-NZ"/>
+        </w:rPr>
+      </w:pPr>
+      <w:r>
+        <w:rPr>
+          <w:lang w:eastAsia="en-NZ"/>
+        </w:rPr>
+        <w:t>--query SecretString --output text &gt; /</w:t>
+      </w:r>
+      <w:proofErr w:type="spellStart"/>
+      <w:r>
+        <w:rPr>
+          <w:lang w:eastAsia="en-NZ"/>
+        </w:rPr>
+        <w:t>tmp</w:t>
+      </w:r>
+      <w:proofErr w:type="spellEnd"/>
+      <w:r>
+        <w:rPr>
+          <w:lang w:eastAsia="en-NZ"/>
+        </w:rPr>
+        <w:t>/play-</w:t>
+      </w:r>
+      <w:proofErr w:type="spellStart"/>
+      <w:r>
+        <w:rPr>
+          <w:lang w:eastAsia="en-NZ"/>
+        </w:rPr>
+        <w:t>key.json</w:t>
+      </w:r>
+      <w:proofErr w:type="spellEnd"/>
+    </w:p>
+    <w:p>
+      <w:pPr>
+        <w:rPr>
+          <w:lang w:eastAsia="en-NZ"/>
+        </w:rPr>
+      </w:pPr>
+      <w:r>
+        <w:rPr>
+          <w:lang w:eastAsia="en-NZ"/>
+        </w:rPr>
+        <w:t>cd packages/mobile</w:t>
+      </w:r>
+    </w:p>
+    <w:p>
+      <w:pPr>
+        <w:rPr>
+          <w:lang w:eastAsia="en-NZ"/>
+        </w:rPr>
+      </w:pPr>
+      <w:proofErr w:type="spellStart"/>
+      <w:r>
+        <w:rPr>
+          <w:lang w:eastAsia="en-NZ"/>
+        </w:rPr>
         <w:lastRenderedPageBreak/>
-        <w:t>cd packages/mobile</w:t>
-      </w:r>
-    </w:p>
-    <w:p>
-      <w:pPr>
-        <w:rPr>
-          <w:lang w:eastAsia="en-NZ"/>
-        </w:rPr>
-      </w:pPr>
-      <w:r>
-        <w:rPr>
-          <w:lang w:eastAsia="en-NZ"/>
-        </w:rPr>
-        <w:t># Submits latest iOS build to App Store Connect</w:t>
-      </w:r>
-    </w:p>
-    <w:p>
-      <w:pPr>
-        <w:rPr>
-          <w:lang w:eastAsia="en-NZ"/>
-        </w:rPr>
-      </w:pPr>
-      <w:proofErr w:type="spellStart"/>
-      <w:r>
-        <w:rPr>
-          <w:lang w:eastAsia="en-NZ"/>
-        </w:rPr>
-        <w:t>eas</w:t>
-      </w:r>
-      <w:proofErr w:type="spellEnd"/>
-      <w:r>
-        <w:rPr>
-          <w:lang w:eastAsia="en-NZ"/>
-        </w:rPr>
-        <w:t xml:space="preserve"> submit --platform </w:t>
-      </w:r>
-      <w:proofErr w:type="spellStart"/>
-      <w:r>
-        <w:rPr>
-          <w:lang w:eastAsia="en-NZ"/>
-        </w:rPr>
-        <w:t>ios</w:t>
-      </w:r>
-      <w:proofErr w:type="spellEnd"/>
-      <w:r>
-        <w:rPr>
-          <w:lang w:eastAsia="en-NZ"/>
-        </w:rPr>
-        <w:t xml:space="preserve"> --latest</w:t>
-      </w:r>
-    </w:p>
-    <w:p>
-      <w:pPr>
-        <w:rPr>
-          <w:lang w:eastAsia="en-NZ"/>
-        </w:rPr>
-      </w:pPr>
-      <w:r>
-        <w:rPr>
-          <w:lang w:eastAsia="en-NZ"/>
-        </w:rPr>
-        <w:t>Build processes in App Store Connect (~10–20 min), then becomes available to internal testers. External testers require Apple Beta App Review (~24h).</w:t>
-      </w:r>
-    </w:p>
-    <w:p>
-      <w:pPr>
-        <w:pStyle w:val="Heading3"/>
-        <w:rPr>
-          <w:lang w:eastAsia="en-NZ"/>
-        </w:rPr>
-      </w:pPr>
-      <w:r>
-        <w:rPr>
-          <w:lang w:eastAsia="en-NZ"/>
-        </w:rPr>
-        <w:t>12.5 Release to Internal Testing (automated submit — Android)</w:t>
-      </w:r>
-    </w:p>
-    <w:p>
-      <w:pPr>
-        <w:rPr>
-          <w:lang w:eastAsia="en-NZ"/>
-        </w:rPr>
-      </w:pPr>
-      <w:proofErr w:type="spellStart"/>
-      <w:r>
-        <w:rPr>
-          <w:lang w:eastAsia="en-NZ"/>
-        </w:rPr>
-        <w:t>eas</w:t>
-      </w:r>
-      <w:proofErr w:type="spellEnd"/>
-      <w:r>
-        <w:rPr>
-          <w:lang w:eastAsia="en-NZ"/>
-        </w:rPr>
-        <w:t xml:space="preserve"> submit for Android requires the Play Console service account JSON. The canonical copy lives in AWS Secrets Manager. Pull at submit time:</w:t>
-      </w:r>
-    </w:p>
-    <w:p>
-      <w:pPr>
-        <w:rPr>
-          <w:lang w:eastAsia="en-NZ"/>
-        </w:rPr>
-      </w:pPr>
-      <w:proofErr w:type="spellStart"/>
-      <w:r>
-        <w:rPr>
-          <w:lang w:eastAsia="en-NZ"/>
-        </w:rPr>
-        <w:t>aws</w:t>
-      </w:r>
-      <w:proofErr w:type="spellEnd"/>
-      <w:r>
-        <w:rPr>
-          <w:lang w:eastAsia="en-NZ"/>
-        </w:rPr>
-        <w:t xml:space="preserve"> </w:t>
-      </w:r>
-      <w:proofErr w:type="spellStart"/>
-      <w:r>
-        <w:rPr>
-          <w:lang w:eastAsia="en-NZ"/>
-        </w:rPr>
-        <w:t>secretsmanager</w:t>
-      </w:r>
-      <w:proofErr w:type="spellEnd"/>
-      <w:r>
-        <w:rPr>
-          <w:lang w:eastAsia="en-NZ"/>
-        </w:rPr>
-        <w:t xml:space="preserve"> get-secret-value \</w:t>
-      </w:r>
-    </w:p>
-    <w:p>
-      <w:pPr>
-        <w:rPr>
-          <w:lang w:eastAsia="en-NZ"/>
-        </w:rPr>
-      </w:pPr>
-      <w:r>
-        <w:rPr>
-          <w:lang w:eastAsia="en-NZ"/>
-        </w:rPr>
-        <w:t xml:space="preserve">--secret-id </w:t>
-      </w:r>
-      <w:proofErr w:type="spellStart"/>
-      <w:r>
-        <w:rPr>
-          <w:lang w:eastAsia="en-NZ"/>
-        </w:rPr>
-        <w:t>auxein</w:t>
-      </w:r>
-      <w:proofErr w:type="spellEnd"/>
-      <w:r>
-        <w:rPr>
-          <w:lang w:eastAsia="en-NZ"/>
-        </w:rPr>
-        <w:t>/grow/play-console-service-account \</w:t>
-      </w:r>
-    </w:p>
-    <w:p>
-      <w:pPr>
-        <w:rPr>
-          <w:lang w:eastAsia="en-NZ"/>
-        </w:rPr>
-      </w:pPr>
-      <w:r>
-        <w:rPr>
-          <w:lang w:eastAsia="en-NZ"/>
-        </w:rPr>
-        <w:t>--region ap-southeast-2 \</w:t>
-      </w:r>
-    </w:p>
-    <w:p>
-      <w:pPr>
-        <w:rPr>
-          <w:lang w:eastAsia="en-NZ"/>
-        </w:rPr>
-      </w:pPr>
-      <w:r>
-        <w:rPr>
-          <w:lang w:eastAsia="en-NZ"/>
-        </w:rPr>
-        <w:t>--query SecretString --output text &gt; /</w:t>
-      </w:r>
-      <w:proofErr w:type="spellStart"/>
-      <w:r>
-        <w:rPr>
-          <w:lang w:eastAsia="en-NZ"/>
-        </w:rPr>
-        <w:t>tmp</w:t>
-      </w:r>
-      <w:proofErr w:type="spellEnd"/>
-      <w:r>
-        <w:rPr>
-          <w:lang w:eastAsia="en-NZ"/>
-        </w:rPr>
-        <w:t>/play-</w:t>
-      </w:r>
-      <w:proofErr w:type="spellStart"/>
-      <w:r>
-        <w:rPr>
-          <w:lang w:eastAsia="en-NZ"/>
-        </w:rPr>
-        <w:t>key.json</w:t>
-      </w:r>
-      <w:proofErr w:type="spellEnd"/>
-    </w:p>
-    <w:p>
-      <w:pPr>
-        <w:rPr>
-          <w:lang w:eastAsia="en-NZ"/>
-        </w:rPr>
-      </w:pPr>
-      <w:r>
-        <w:rPr>
-          <w:lang w:eastAsia="en-NZ"/>
-        </w:rPr>
-        <w:t>cd packages/mobile</w:t>
-      </w:r>
-    </w:p>
-    <w:p>
-      <w:pPr>
-        <w:rPr>
-          <w:lang w:eastAsia="en-NZ"/>
-        </w:rPr>
-      </w:pPr>
-      <w:proofErr w:type="spellStart"/>
-      <w:r>
-        <w:rPr>
-          <w:lang w:eastAsia="en-NZ"/>
-        </w:rPr>
         <w:t>eas</w:t>
       </w:r>
       <w:proofErr w:type="spellEnd"/>
@@ -15216,7 +15968,6 @@
         <w:rPr>
           <w:lang w:eastAsia="en-NZ"/>
         </w:rPr>
-        <w:lastRenderedPageBreak/>
         <w:t>Content rating questionnaire</w:t>
       </w:r>
     </w:p>
@@ -15510,6 +16261,7 @@
               <w:rPr>
                 <w:lang w:eastAsia="en-NZ"/>
               </w:rPr>
+              <w:lastRenderedPageBreak/>
               <w:t>TestFlight build stuck "Processing"</w:t>
             </w:r>
           </w:p>
@@ -15966,7 +16718,6 @@
           <w:rFonts w:asciiTheme="minorHAnsi" w:eastAsia="Arial" w:hAnsiTheme="minorHAnsi"/>
           <w:lang w:eastAsia="en-NZ"/>
         </w:rPr>
-        <w:lastRenderedPageBreak/>
         <w:t>1</w:t>
       </w:r>
       <w:r>
@@ -16767,6 +17518,181 @@
     </w:lvl>
   </w:abstractNum>
   <w:abstractNum w:abstractNumId="5" w15:restartNumberingAfterBreak="0">
+    <w:nsid w:val="2C713998"/>
+    <w:multiLevelType w:val="hybridMultilevel"/>
+    <w:tmpl w:val="29120F82"/>
+    <w:lvl w:ilvl="0" w:tplc="1409000F">
+      <w:start w:val="1"/>
+      <w:numFmt w:val="decimal"/>
+      <w:lvlText w:val="%1."/>
+      <w:lvlJc w:val="left"/>
+      <w:pPr>
+        <w:ind w:left="720" w:hanging="360"/>
+      </w:pPr>
+      <w:rPr>
+        <w:rFonts w:hint="default"/>
+      </w:rPr>
+    </w:lvl>
+    <w:lvl w:ilvl="1" w:tplc="14090019" w:tentative="1">
+      <w:start w:val="1"/>
+      <w:numFmt w:val="lowerLetter"/>
+      <w:lvlText w:val="%2."/>
+      <w:lvlJc w:val="left"/>
+      <w:pPr>
+        <w:ind w:left="1440" w:hanging="360"/>
+      </w:pPr>
+    </w:lvl>
+    <w:lvl w:ilvl="2" w:tplc="1409001B" w:tentative="1">
+      <w:start w:val="1"/>
+      <w:numFmt w:val="lowerRoman"/>
+      <w:lvlText w:val="%3."/>
+      <w:lvlJc w:val="right"/>
+      <w:pPr>
+        <w:ind w:left="2160" w:hanging="180"/>
+      </w:pPr>
+    </w:lvl>
+    <w:lvl w:ilvl="3" w:tplc="1409000F" w:tentative="1">
+      <w:start w:val="1"/>
+      <w:numFmt w:val="decimal"/>
+      <w:lvlText w:val="%4."/>
+      <w:lvlJc w:val="left"/>
+      <w:pPr>
+        <w:ind w:left="2880" w:hanging="360"/>
+      </w:pPr>
+    </w:lvl>
+    <w:lvl w:ilvl="4" w:tplc="14090019" w:tentative="1">
+      <w:start w:val="1"/>
+      <w:numFmt w:val="lowerLetter"/>
+      <w:lvlText w:val="%5."/>
+      <w:lvlJc w:val="left"/>
+      <w:pPr>
+        <w:ind w:left="3600" w:hanging="360"/>
+      </w:pPr>
+    </w:lvl>
+    <w:lvl w:ilvl="5" w:tplc="1409001B" w:tentative="1">
+      <w:start w:val="1"/>
+      <w:numFmt w:val="lowerRoman"/>
+      <w:lvlText w:val="%6."/>
+      <w:lvlJc w:val="right"/>
+      <w:pPr>
+        <w:ind w:left="4320" w:hanging="180"/>
+      </w:pPr>
+    </w:lvl>
+    <w:lvl w:ilvl="6" w:tplc="1409000F" w:tentative="1">
+      <w:start w:val="1"/>
+      <w:numFmt w:val="decimal"/>
+      <w:lvlText w:val="%7."/>
+      <w:lvlJc w:val="left"/>
+      <w:pPr>
+        <w:ind w:left="5040" w:hanging="360"/>
+      </w:pPr>
+    </w:lvl>
+    <w:lvl w:ilvl="7" w:tplc="14090019" w:tentative="1">
+      <w:start w:val="1"/>
+      <w:numFmt w:val="lowerLetter"/>
+      <w:lvlText w:val="%8."/>
+      <w:lvlJc w:val="left"/>
+      <w:pPr>
+        <w:ind w:left="5760" w:hanging="360"/>
+      </w:pPr>
+    </w:lvl>
+    <w:lvl w:ilvl="8" w:tplc="1409001B" w:tentative="1">
+      <w:start w:val="1"/>
+      <w:numFmt w:val="lowerRoman"/>
+      <w:lvlText w:val="%9."/>
+      <w:lvlJc w:val="right"/>
+      <w:pPr>
+        <w:ind w:left="6480" w:hanging="180"/>
+      </w:pPr>
+    </w:lvl>
+  </w:abstractNum>
+  <w:abstractNum w:abstractNumId="6" w15:restartNumberingAfterBreak="0">
+    <w:nsid w:val="313A3B67"/>
+    <w:multiLevelType w:val="hybridMultilevel"/>
+    <w:tmpl w:val="3F10AA4A"/>
+    <w:lvl w:ilvl="0" w:tplc="1409000F">
+      <w:start w:val="1"/>
+      <w:numFmt w:val="decimal"/>
+      <w:lvlText w:val="%1."/>
+      <w:lvlJc w:val="left"/>
+      <w:pPr>
+        <w:ind w:left="720" w:hanging="360"/>
+      </w:pPr>
+    </w:lvl>
+    <w:lvl w:ilvl="1" w:tplc="14090019" w:tentative="1">
+      <w:start w:val="1"/>
+      <w:numFmt w:val="lowerLetter"/>
+      <w:lvlText w:val="%2."/>
+      <w:lvlJc w:val="left"/>
+      <w:pPr>
+        <w:ind w:left="1440" w:hanging="360"/>
+      </w:pPr>
+    </w:lvl>
+    <w:lvl w:ilvl="2" w:tplc="1409001B" w:tentative="1">
+      <w:start w:val="1"/>
+      <w:numFmt w:val="lowerRoman"/>
+      <w:lvlText w:val="%3."/>
+      <w:lvlJc w:val="right"/>
+      <w:pPr>
+        <w:ind w:left="2160" w:hanging="180"/>
+      </w:pPr>
+    </w:lvl>
+    <w:lvl w:ilvl="3" w:tplc="1409000F" w:tentative="1">
+      <w:start w:val="1"/>
+      <w:numFmt w:val="decimal"/>
+      <w:lvlText w:val="%4."/>
+      <w:lvlJc w:val="left"/>
+      <w:pPr>
+        <w:ind w:left="2880" w:hanging="360"/>
+      </w:pPr>
+    </w:lvl>
+    <w:lvl w:ilvl="4" w:tplc="14090019" w:tentative="1">
+      <w:start w:val="1"/>
+      <w:numFmt w:val="lowerLetter"/>
+      <w:lvlText w:val="%5."/>
+      <w:lvlJc w:val="left"/>
+      <w:pPr>
+        <w:ind w:left="3600" w:hanging="360"/>
+      </w:pPr>
+    </w:lvl>
+    <w:lvl w:ilvl="5" w:tplc="1409001B" w:tentative="1">
+      <w:start w:val="1"/>
+      <w:numFmt w:val="lowerRoman"/>
+      <w:lvlText w:val="%6."/>
+      <w:lvlJc w:val="right"/>
+      <w:pPr>
+        <w:ind w:left="4320" w:hanging="180"/>
+      </w:pPr>
+    </w:lvl>
+    <w:lvl w:ilvl="6" w:tplc="1409000F" w:tentative="1">
+      <w:start w:val="1"/>
+      <w:numFmt w:val="decimal"/>
+      <w:lvlText w:val="%7."/>
+      <w:lvlJc w:val="left"/>
+      <w:pPr>
+        <w:ind w:left="5040" w:hanging="360"/>
+      </w:pPr>
+    </w:lvl>
+    <w:lvl w:ilvl="7" w:tplc="14090019" w:tentative="1">
+      <w:start w:val="1"/>
+      <w:numFmt w:val="lowerLetter"/>
+      <w:lvlText w:val="%8."/>
+      <w:lvlJc w:val="left"/>
+      <w:pPr>
+        <w:ind w:left="5760" w:hanging="360"/>
+      </w:pPr>
+    </w:lvl>
+    <w:lvl w:ilvl="8" w:tplc="1409001B" w:tentative="1">
+      <w:start w:val="1"/>
+      <w:numFmt w:val="lowerRoman"/>
+      <w:lvlText w:val="%9."/>
+      <w:lvlJc w:val="right"/>
+      <w:pPr>
+        <w:ind w:left="6480" w:hanging="180"/>
+      </w:pPr>
+    </w:lvl>
+  </w:abstractNum>
+  <w:abstractNum w:abstractNumId="7" w15:restartNumberingAfterBreak="0">
     <w:nsid w:val="3549615C"/>
     <w:multiLevelType w:val="hybridMultilevel"/>
     <w:tmpl w:val="891C6016"/>
@@ -16844,7 +17770,7 @@
       </w:pPr>
     </w:lvl>
   </w:abstractNum>
-  <w:abstractNum w:abstractNumId="6" w15:restartNumberingAfterBreak="0">
+  <w:abstractNum w:abstractNumId="8" w15:restartNumberingAfterBreak="0">
     <w:nsid w:val="3B490D95"/>
     <w:multiLevelType w:val="multilevel"/>
     <w:tmpl w:val="8B581462"/>
@@ -16993,7 +17919,7 @@
       </w:rPr>
     </w:lvl>
   </w:abstractNum>
-  <w:abstractNum w:abstractNumId="7" w15:restartNumberingAfterBreak="0">
+  <w:abstractNum w:abstractNumId="9" w15:restartNumberingAfterBreak="0">
     <w:nsid w:val="489376F8"/>
     <w:multiLevelType w:val="multilevel"/>
     <w:tmpl w:val="D5F6D934"/>
@@ -17142,7 +18068,7 @@
       </w:rPr>
     </w:lvl>
   </w:abstractNum>
-  <w:abstractNum w:abstractNumId="8" w15:restartNumberingAfterBreak="0">
+  <w:abstractNum w:abstractNumId="10" w15:restartNumberingAfterBreak="0">
     <w:nsid w:val="4EA13A5B"/>
     <w:multiLevelType w:val="multilevel"/>
     <w:tmpl w:val="EAFC48D0"/>
@@ -17291,7 +18217,7 @@
       </w:rPr>
     </w:lvl>
   </w:abstractNum>
-  <w:abstractNum w:abstractNumId="9" w15:restartNumberingAfterBreak="0">
+  <w:abstractNum w:abstractNumId="11" w15:restartNumberingAfterBreak="0">
     <w:nsid w:val="594A45D9"/>
     <w:multiLevelType w:val="multilevel"/>
     <w:tmpl w:val="9B42BAB2"/>
@@ -17404,7 +18330,7 @@
       </w:pPr>
     </w:lvl>
   </w:abstractNum>
-  <w:abstractNum w:abstractNumId="10" w15:restartNumberingAfterBreak="0">
+  <w:abstractNum w:abstractNumId="12" w15:restartNumberingAfterBreak="0">
     <w:nsid w:val="661B673D"/>
     <w:multiLevelType w:val="multilevel"/>
     <w:tmpl w:val="B4B03FE6"/>
@@ -17553,7 +18479,7 @@
       </w:rPr>
     </w:lvl>
   </w:abstractNum>
-  <w:abstractNum w:abstractNumId="11" w15:restartNumberingAfterBreak="0">
+  <w:abstractNum w:abstractNumId="13" w15:restartNumberingAfterBreak="0">
     <w:nsid w:val="69E138C4"/>
     <w:multiLevelType w:val="multilevel"/>
     <w:tmpl w:val="D160045C"/>
@@ -17702,7 +18628,7 @@
       </w:rPr>
     </w:lvl>
   </w:abstractNum>
-  <w:abstractNum w:abstractNumId="12" w15:restartNumberingAfterBreak="0">
+  <w:abstractNum w:abstractNumId="14" w15:restartNumberingAfterBreak="0">
     <w:nsid w:val="718248AC"/>
     <w:multiLevelType w:val="multilevel"/>
     <w:tmpl w:val="5EEAA31A"/>
@@ -17851,7 +18777,7 @@
       </w:rPr>
     </w:lvl>
   </w:abstractNum>
-  <w:abstractNum w:abstractNumId="13" w15:restartNumberingAfterBreak="0">
+  <w:abstractNum w:abstractNumId="15" w15:restartNumberingAfterBreak="0">
     <w:nsid w:val="78E37E4A"/>
     <w:multiLevelType w:val="multilevel"/>
     <w:tmpl w:val="6628721E"/>
@@ -18000,7 +18926,7 @@
       </w:rPr>
     </w:lvl>
   </w:abstractNum>
-  <w:abstractNum w:abstractNumId="14" w15:restartNumberingAfterBreak="0">
+  <w:abstractNum w:abstractNumId="16" w15:restartNumberingAfterBreak="0">
     <w:nsid w:val="78EE138F"/>
     <w:multiLevelType w:val="multilevel"/>
     <w:tmpl w:val="EDE6178E"/>
@@ -18150,7 +19076,7 @@
     </w:lvl>
   </w:abstractNum>
   <w:num w:numId="1" w16cid:durableId="61488855">
-    <w:abstractNumId w:val="5"/>
+    <w:abstractNumId w:val="7"/>
     <w:lvlOverride w:ilvl="0">
       <w:startOverride w:val="1"/>
     </w:lvlOverride>
@@ -18167,43 +19093,49 @@
     <w:abstractNumId w:val="1"/>
   </w:num>
   <w:num w:numId="3" w16cid:durableId="1906525780">
-    <w:abstractNumId w:val="10"/>
+    <w:abstractNumId w:val="12"/>
   </w:num>
   <w:num w:numId="4" w16cid:durableId="1576235368">
-    <w:abstractNumId w:val="9"/>
+    <w:abstractNumId w:val="11"/>
   </w:num>
   <w:num w:numId="5" w16cid:durableId="1133714925">
-    <w:abstractNumId w:val="12"/>
+    <w:abstractNumId w:val="14"/>
   </w:num>
   <w:num w:numId="6" w16cid:durableId="801576157">
-    <w:abstractNumId w:val="7"/>
+    <w:abstractNumId w:val="9"/>
   </w:num>
   <w:num w:numId="7" w16cid:durableId="426314259">
     <w:abstractNumId w:val="4"/>
   </w:num>
   <w:num w:numId="8" w16cid:durableId="1132359819">
-    <w:abstractNumId w:val="11"/>
+    <w:abstractNumId w:val="13"/>
   </w:num>
   <w:num w:numId="9" w16cid:durableId="773794311">
-    <w:abstractNumId w:val="6"/>
+    <w:abstractNumId w:val="8"/>
   </w:num>
   <w:num w:numId="10" w16cid:durableId="473448278">
     <w:abstractNumId w:val="0"/>
   </w:num>
   <w:num w:numId="11" w16cid:durableId="903486432">
-    <w:abstractNumId w:val="13"/>
+    <w:abstractNumId w:val="15"/>
   </w:num>
   <w:num w:numId="12" w16cid:durableId="981274075">
     <w:abstractNumId w:val="3"/>
   </w:num>
   <w:num w:numId="13" w16cid:durableId="1622495884">
-    <w:abstractNumId w:val="8"/>
+    <w:abstractNumId w:val="10"/>
   </w:num>
   <w:num w:numId="14" w16cid:durableId="151145013">
-    <w:abstractNumId w:val="14"/>
+    <w:abstractNumId w:val="16"/>
   </w:num>
   <w:num w:numId="15" w16cid:durableId="1981302926">
     <w:abstractNumId w:val="2"/>
+  </w:num>
+  <w:num w:numId="16" w16cid:durableId="2109570911">
+    <w:abstractNumId w:val="6"/>
+  </w:num>
+  <w:num w:numId="17" w16cid:durableId="1414547043">
+    <w:abstractNumId w:val="5"/>
   </w:num>
 </w:numbering>
 </file>

</xml_diff>